<commit_message>
Add shared presentation & localization for Report V1
Introduce a shared presentation model and localization layer for Report V1. New modules: engines/report_engine/localization (labels_vi, display, customer_text, shensha_audit) and engines/report_engine/rendering/report_sections_v1. Refactor HTML and DOCX renderers to consume build_presented_report(), unwrap leaked runtime objects, map internal codes to Vietnamese labels, and filter Rule Engine instructional sentences. Add unit tests for localization and shensha audit, plus documentation and regenerated CASE-0001 artifacts and runtime gap reports. Preserves ReportInputV1 contract and avoids inventing missing runtime data.
</commit_message>
<xml_diff>
--- a/knowledge/report_v1_validation/exports/BTE_CASE-0001_Nguyen_Tien_Son_Report_V1_0.docx
+++ b/knowledge/report_v1_validation/exports/BTE_CASE-0001_Nguyen_Tien_Son_Report_V1_0.docx
@@ -17,7 +17,7 @@
     </w:p>
     <w:p>
       <w:r>
-        <w:t>CASE-0001 · 2026-08-12T10:28:43Z</w:t>
+        <w:t>Nguyễn Tiến Sơn · CASE-0001 · 2026-08-12T10:45:53Z</w:t>
       </w:r>
     </w:p>
     <w:p>
@@ -82,7 +82,7 @@
           </w:tcPr>
           <w:p>
             <w:r>
-              <w:t>male</w:t>
+              <w:t>Nam</w:t>
             </w:r>
           </w:p>
         </w:tc>
@@ -236,7 +236,7 @@
           </w:tcPr>
           <w:p>
             <w:r>
-              <w:t>{'name': 'Đại Hàn', 'index': 23}</w:t>
+              <w:t>Đại Hàn</w:t>
             </w:r>
           </w:p>
         </w:tc>
@@ -257,16 +257,17 @@
         <w:tblLook w:firstColumn="1" w:firstRow="1" w:lastColumn="0" w:lastRow="0" w:noHBand="0" w:noVBand="1" w:val="04A0"/>
       </w:tblPr>
       <w:tblGrid>
-        <w:gridCol w:w="1928"/>
-        <w:gridCol w:w="1928"/>
-        <w:gridCol w:w="1928"/>
-        <w:gridCol w:w="1928"/>
-        <w:gridCol w:w="1928"/>
+        <w:gridCol w:w="1606"/>
+        <w:gridCol w:w="1606"/>
+        <w:gridCol w:w="1606"/>
+        <w:gridCol w:w="1606"/>
+        <w:gridCol w:w="1606"/>
+        <w:gridCol w:w="1606"/>
       </w:tblGrid>
       <w:tr>
         <w:tc>
           <w:tcPr>
-            <w:tcW w:type="dxa" w:w="1928"/>
+            <w:tcW w:type="dxa" w:w="1606"/>
           </w:tcPr>
           <w:p>
             <w:r>
@@ -276,7 +277,7 @@
         </w:tc>
         <w:tc>
           <w:tcPr>
-            <w:tcW w:type="dxa" w:w="1928"/>
+            <w:tcW w:type="dxa" w:w="1606"/>
           </w:tcPr>
           <w:p>
             <w:r>
@@ -286,7 +287,7 @@
         </w:tc>
         <w:tc>
           <w:tcPr>
-            <w:tcW w:type="dxa" w:w="1928"/>
+            <w:tcW w:type="dxa" w:w="1606"/>
           </w:tcPr>
           <w:p>
             <w:r>
@@ -296,7 +297,7 @@
         </w:tc>
         <w:tc>
           <w:tcPr>
-            <w:tcW w:type="dxa" w:w="1928"/>
+            <w:tcW w:type="dxa" w:w="1606"/>
           </w:tcPr>
           <w:p>
             <w:r>
@@ -306,7 +307,7 @@
         </w:tc>
         <w:tc>
           <w:tcPr>
-            <w:tcW w:type="dxa" w:w="1928"/>
+            <w:tcW w:type="dxa" w:w="1606"/>
           </w:tcPr>
           <w:p>
             <w:r>
@@ -314,11 +315,21 @@
             </w:r>
           </w:p>
         </w:tc>
+        <w:tc>
+          <w:tcPr>
+            <w:tcW w:type="dxa" w:w="1606"/>
+          </w:tcPr>
+          <w:p>
+            <w:r>
+              <w:t>Trường sinh</w:t>
+            </w:r>
+          </w:p>
+        </w:tc>
       </w:tr>
       <w:tr>
         <w:tc>
           <w:tcPr>
-            <w:tcW w:type="dxa" w:w="1928"/>
+            <w:tcW w:type="dxa" w:w="1606"/>
           </w:tcPr>
           <w:p>
             <w:r>
@@ -328,7 +339,7 @@
         </w:tc>
         <w:tc>
           <w:tcPr>
-            <w:tcW w:type="dxa" w:w="1928"/>
+            <w:tcW w:type="dxa" w:w="1606"/>
           </w:tcPr>
           <w:p>
             <w:r>
@@ -338,7 +349,7 @@
         </w:tc>
         <w:tc>
           <w:tcPr>
-            <w:tcW w:type="dxa" w:w="1928"/>
+            <w:tcW w:type="dxa" w:w="1606"/>
           </w:tcPr>
           <w:p>
             <w:r>
@@ -348,7 +359,7 @@
         </w:tc>
         <w:tc>
           <w:tcPr>
-            <w:tcW w:type="dxa" w:w="1928"/>
+            <w:tcW w:type="dxa" w:w="1606"/>
           </w:tcPr>
           <w:p>
             <w:r>
@@ -358,7 +369,7 @@
         </w:tc>
         <w:tc>
           <w:tcPr>
-            <w:tcW w:type="dxa" w:w="1928"/>
+            <w:tcW w:type="dxa" w:w="1606"/>
           </w:tcPr>
           <w:p>
             <w:r>
@@ -366,11 +377,21 @@
             </w:r>
           </w:p>
         </w:tc>
+        <w:tc>
+          <w:tcPr>
+            <w:tcW w:type="dxa" w:w="1606"/>
+          </w:tcPr>
+          <w:p>
+            <w:r>
+              <w:t>Tuyệt</w:t>
+            </w:r>
+          </w:p>
+        </w:tc>
       </w:tr>
       <w:tr>
         <w:tc>
           <w:tcPr>
-            <w:tcW w:type="dxa" w:w="1928"/>
+            <w:tcW w:type="dxa" w:w="1606"/>
           </w:tcPr>
           <w:p>
             <w:r>
@@ -380,7 +401,7 @@
         </w:tc>
         <w:tc>
           <w:tcPr>
-            <w:tcW w:type="dxa" w:w="1928"/>
+            <w:tcW w:type="dxa" w:w="1606"/>
           </w:tcPr>
           <w:p>
             <w:r>
@@ -390,7 +411,7 @@
         </w:tc>
         <w:tc>
           <w:tcPr>
-            <w:tcW w:type="dxa" w:w="1928"/>
+            <w:tcW w:type="dxa" w:w="1606"/>
           </w:tcPr>
           <w:p>
             <w:r>
@@ -400,7 +421,7 @@
         </w:tc>
         <w:tc>
           <w:tcPr>
-            <w:tcW w:type="dxa" w:w="1928"/>
+            <w:tcW w:type="dxa" w:w="1606"/>
           </w:tcPr>
           <w:p>
             <w:r>
@@ -410,7 +431,7 @@
         </w:tc>
         <w:tc>
           <w:tcPr>
-            <w:tcW w:type="dxa" w:w="1928"/>
+            <w:tcW w:type="dxa" w:w="1606"/>
           </w:tcPr>
           <w:p>
             <w:r>
@@ -418,11 +439,21 @@
             </w:r>
           </w:p>
         </w:tc>
+        <w:tc>
+          <w:tcPr>
+            <w:tcW w:type="dxa" w:w="1606"/>
+          </w:tcPr>
+          <w:p>
+            <w:r>
+              <w:t>Mộ</w:t>
+            </w:r>
+          </w:p>
+        </w:tc>
       </w:tr>
       <w:tr>
         <w:tc>
           <w:tcPr>
-            <w:tcW w:type="dxa" w:w="1928"/>
+            <w:tcW w:type="dxa" w:w="1606"/>
           </w:tcPr>
           <w:p>
             <w:r>
@@ -432,7 +463,7 @@
         </w:tc>
         <w:tc>
           <w:tcPr>
-            <w:tcW w:type="dxa" w:w="1928"/>
+            <w:tcW w:type="dxa" w:w="1606"/>
           </w:tcPr>
           <w:p>
             <w:r>
@@ -442,7 +473,7 @@
         </w:tc>
         <w:tc>
           <w:tcPr>
-            <w:tcW w:type="dxa" w:w="1928"/>
+            <w:tcW w:type="dxa" w:w="1606"/>
           </w:tcPr>
           <w:p>
             <w:r>
@@ -452,7 +483,7 @@
         </w:tc>
         <w:tc>
           <w:tcPr>
-            <w:tcW w:type="dxa" w:w="1928"/>
+            <w:tcW w:type="dxa" w:w="1606"/>
           </w:tcPr>
           <w:p>
             <w:r>
@@ -462,7 +493,7 @@
         </w:tc>
         <w:tc>
           <w:tcPr>
-            <w:tcW w:type="dxa" w:w="1928"/>
+            <w:tcW w:type="dxa" w:w="1606"/>
           </w:tcPr>
           <w:p>
             <w:r>
@@ -470,11 +501,21 @@
             </w:r>
           </w:p>
         </w:tc>
+        <w:tc>
+          <w:tcPr>
+            <w:tcW w:type="dxa" w:w="1606"/>
+          </w:tcPr>
+          <w:p>
+            <w:r>
+              <w:t>Mộc Dục</w:t>
+            </w:r>
+          </w:p>
+        </w:tc>
       </w:tr>
       <w:tr>
         <w:tc>
           <w:tcPr>
-            <w:tcW w:type="dxa" w:w="1928"/>
+            <w:tcW w:type="dxa" w:w="1606"/>
           </w:tcPr>
           <w:p>
             <w:r>
@@ -484,7 +525,7 @@
         </w:tc>
         <w:tc>
           <w:tcPr>
-            <w:tcW w:type="dxa" w:w="1928"/>
+            <w:tcW w:type="dxa" w:w="1606"/>
           </w:tcPr>
           <w:p>
             <w:r>
@@ -494,7 +535,7 @@
         </w:tc>
         <w:tc>
           <w:tcPr>
-            <w:tcW w:type="dxa" w:w="1928"/>
+            <w:tcW w:type="dxa" w:w="1606"/>
           </w:tcPr>
           <w:p>
             <w:r>
@@ -504,7 +545,7 @@
         </w:tc>
         <w:tc>
           <w:tcPr>
-            <w:tcW w:type="dxa" w:w="1928"/>
+            <w:tcW w:type="dxa" w:w="1606"/>
           </w:tcPr>
           <w:p>
             <w:r>
@@ -514,11 +555,21 @@
         </w:tc>
         <w:tc>
           <w:tcPr>
-            <w:tcW w:type="dxa" w:w="1928"/>
+            <w:tcW w:type="dxa" w:w="1606"/>
           </w:tcPr>
           <w:p>
             <w:r>
               <w:t>Thiên Ấn</w:t>
+            </w:r>
+          </w:p>
+        </w:tc>
+        <w:tc>
+          <w:tcPr>
+            <w:tcW w:type="dxa" w:w="1606"/>
+          </w:tcPr>
+          <w:p>
+            <w:r>
+              <w:t>Tuyệt</w:t>
             </w:r>
           </w:p>
         </w:tc>
@@ -534,7 +585,7 @@
     </w:p>
     <w:p>
       <w:r>
-        <w:t>Chưa đủ dữ liệu để đưa ra kết luận.</w:t>
+        <w:t>DATA NOT PROVIDED BY RUNTIME</w:t>
       </w:r>
     </w:p>
     <w:p>
@@ -616,7 +667,7 @@
           </w:tcPr>
           <w:p>
             <w:r>
-              <w:t>strong</w:t>
+              <w:t>Thân vượng</w:t>
             </w:r>
           </w:p>
         </w:tc>
@@ -638,7 +689,51 @@
           </w:tcPr>
           <w:p>
             <w:r>
-              <w:t>strong</w:t>
+              <w:t>Thân vượng</w:t>
+            </w:r>
+          </w:p>
+        </w:tc>
+      </w:tr>
+      <w:tr>
+        <w:tc>
+          <w:tcPr>
+            <w:tcW w:type="dxa" w:w="4819"/>
+          </w:tcPr>
+          <w:p>
+            <w:r>
+              <w:t>Hỗ trợ mùa</w:t>
+            </w:r>
+          </w:p>
+        </w:tc>
+        <w:tc>
+          <w:tcPr>
+            <w:tcW w:type="dxa" w:w="4819"/>
+          </w:tcPr>
+          <w:p>
+            <w:r>
+              <w:t>0.25</w:t>
+            </w:r>
+          </w:p>
+        </w:tc>
+      </w:tr>
+      <w:tr>
+        <w:tc>
+          <w:tcPr>
+            <w:tcW w:type="dxa" w:w="4819"/>
+          </w:tcPr>
+          <w:p>
+            <w:r>
+              <w:t>Căn</w:t>
+            </w:r>
+          </w:p>
+        </w:tc>
+        <w:tc>
+          <w:tcPr>
+            <w:tcW w:type="dxa" w:w="4819"/>
+          </w:tcPr>
+          <w:p>
+            <w:r>
+              <w:t>0.12</w:t>
             </w:r>
           </w:p>
         </w:tc>
@@ -674,7 +769,7 @@
           </w:tcPr>
           <w:p>
             <w:r>
-              <w:t>Hiển</w:t>
+              <w:t>Thập thần hiển</w:t>
             </w:r>
           </w:p>
         </w:tc>
@@ -835,7 +930,29 @@
           </w:tcPr>
           <w:p>
             <w:r>
-              <w:t>success</w:t>
+              <w:t>Đắc cách</w:t>
+            </w:r>
+          </w:p>
+        </w:tc>
+      </w:tr>
+      <w:tr>
+        <w:tc>
+          <w:tcPr>
+            <w:tcW w:type="dxa" w:w="4819"/>
+          </w:tcPr>
+          <w:p>
+            <w:r>
+              <w:t>Độ tin cậy</w:t>
+            </w:r>
+          </w:p>
+        </w:tc>
+        <w:tc>
+          <w:tcPr>
+            <w:tcW w:type="dxa" w:w="4819"/>
+          </w:tcPr>
+          <w:p>
+            <w:r>
+              <w:t>72</w:t>
             </w:r>
           </w:p>
         </w:tc>
@@ -930,6 +1047,28 @@
           </w:p>
         </w:tc>
       </w:tr>
+      <w:tr>
+        <w:tc>
+          <w:tcPr>
+            <w:tcW w:type="dxa" w:w="4819"/>
+          </w:tcPr>
+          <w:p>
+            <w:r>
+              <w:t>Điều hậu nhiệt</w:t>
+            </w:r>
+          </w:p>
+        </w:tc>
+        <w:tc>
+          <w:tcPr>
+            <w:tcW w:type="dxa" w:w="4819"/>
+          </w:tcPr>
+          <w:p>
+            <w:r>
+              <w:t>Nhiệt</w:t>
+            </w:r>
+          </w:p>
+        </w:tc>
+      </w:tr>
     </w:tbl>
     <w:p>
       <w:r>
@@ -1015,7 +1154,7 @@
           </w:tcPr>
           <w:p>
             <w:r>
-              <w:t>shensha</w:t>
+              <w:t>Thần sát</w:t>
             </w:r>
           </w:p>
         </w:tc>
@@ -1057,7 +1196,7 @@
           </w:tcPr>
           <w:p>
             <w:r>
-              <w:t>shensha</w:t>
+              <w:t>Thần sát</w:t>
             </w:r>
           </w:p>
         </w:tc>
@@ -1099,7 +1238,7 @@
           </w:tcPr>
           <w:p>
             <w:r>
-              <w:t>shensha</w:t>
+              <w:t>Thần sát</w:t>
             </w:r>
           </w:p>
         </w:tc>
@@ -1141,7 +1280,7 @@
           </w:tcPr>
           <w:p>
             <w:r>
-              <w:t>shensha</w:t>
+              <w:t>Thần sát</w:t>
             </w:r>
           </w:p>
         </w:tc>
@@ -1183,7 +1322,7 @@
           </w:tcPr>
           <w:p>
             <w:r>
-              <w:t>shensha</w:t>
+              <w:t>Thần sát</w:t>
             </w:r>
           </w:p>
         </w:tc>
@@ -1225,7 +1364,7 @@
           </w:tcPr>
           <w:p>
             <w:r>
-              <w:t>shensha</w:t>
+              <w:t>Thần sát</w:t>
             </w:r>
           </w:p>
         </w:tc>
@@ -1267,7 +1406,7 @@
           </w:tcPr>
           <w:p>
             <w:r>
-              <w:t>shensha</w:t>
+              <w:t>Thần sát</w:t>
             </w:r>
           </w:p>
         </w:tc>
@@ -1309,7 +1448,7 @@
           </w:tcPr>
           <w:p>
             <w:r>
-              <w:t>shensha</w:t>
+              <w:t>Thần sát</w:t>
             </w:r>
           </w:p>
         </w:tc>
@@ -1483,51 +1622,16 @@
       </w:tr>
     </w:tbl>
     <w:p>
+      <w:r>
+        <w:t>Toàn bộ đại vận (full luck cycles): DATA NOT PROVIDED BY RUNTIME</w:t>
+      </w:r>
+    </w:p>
+    <w:p>
       <w:pPr>
         <w:pStyle w:val="Heading1"/>
       </w:pPr>
       <w:r>
         <w:t>10. Luận giải tổng thể</w:t>
-      </w:r>
-    </w:p>
-    <w:p>
-      <w:r>
-        <w:t>Áp dụng bảng trạng thái ngũ hành của mùa đã được xác định.</w:t>
-      </w:r>
-    </w:p>
-    <w:p>
-      <w:r>
-        <w:t>Ưu tiên xác định mùa theo Tiết khí nếu dữ liệu Tiết khí có sẵn.</w:t>
-      </w:r>
-    </w:p>
-    <w:p>
-      <w:r>
-        <w:t>Nếu chưa có Tiết khí thì xác định mùa theo Địa Chi tháng.</w:t>
-      </w:r>
-    </w:p>
-    <w:p>
-      <w:r>
-        <w:t>Nếu có dữ liệu Tiết khí thì sử dụng Tiết khí để xác nhận trạng thái mùa.</w:t>
-      </w:r>
-    </w:p>
-    <w:p>
-      <w:r>
-        <w:t>Tháng âm lịch chỉ dùng để tham khảo khi không có dữ liệu khác.</w:t>
-      </w:r>
-    </w:p>
-    <w:p>
-      <w:r>
-        <w:t>Kiểm tra tính hợp lệ của mùa trước khi áp dụng điều chỉnh.</w:t>
-      </w:r>
-    </w:p>
-    <w:p>
-      <w:r>
-        <w:t>Kích hoạt khi xác định Chính Cách.</w:t>
-      </w:r>
-    </w:p>
-    <w:p>
-      <w:r>
-        <w:t>Kích hoạt khi tháng sinh thuộc mùa Đông.</w:t>
       </w:r>
     </w:p>
     <w:p>
@@ -1558,7 +1662,7 @@
     </w:p>
     <w:p>
       <w:r>
-        <w:t>Chưa đủ dữ liệu để đưa ra kết luận.</w:t>
+        <w:t>DATA NOT PROVIDED BY RUNTIME</w:t>
       </w:r>
     </w:p>
     <w:p>
@@ -1597,7 +1701,7 @@
     </w:p>
     <w:p>
       <w:r>
-        <w:t>Chưa đủ dữ liệu để đưa ra kết luận.</w:t>
+        <w:t>DATA NOT PROVIDED BY RUNTIME</w:t>
       </w:r>
     </w:p>
     <w:p>
@@ -1623,7 +1727,7 @@
     </w:p>
     <w:p>
       <w:r>
-        <w:t>Yếu tố hao/khắc: Bị Quan Sát khắc.</w:t>
+        <w:t>Điểm tổng hợp: 51.25 — hạng D+.</w:t>
       </w:r>
     </w:p>
     <w:p/>
@@ -1632,7 +1736,7 @@
         <w:pStyle w:val="Caption"/>
       </w:pPr>
       <w:r>
-        <w:t>BTE Platform · Report V1 · 1.0</w:t>
+        <w:t>BTE Platform · Report V1 · 1.0 · 1.0.0</w:t>
       </w:r>
     </w:p>
     <w:sectPr>

</xml_diff>

<commit_message>
Preserve canonical strength and useful-god propagation
Stop ScoreEngine from remapping canonical strength: Score contributions are appended without overwriting strength.level/strength.score. Propagate Useful God data through the rule context: preserve favorable_gods/unfavorable_gods, expose candidate_type, support stem↔ten-god localization (including Han→Vi aliases), and add helpers for locating and normalizing useful-god values. Refresh RuleContext facts from UsefulGod fields and avoid emitting a false "Không có Dụng thần" in interpretation text. Update strength labels ("Thân vượng"/"Thân nhược") and adjust related summaries. Add unit and integration tests to lock these invariants.
</commit_message>
<xml_diff>
--- a/knowledge/report_v1_validation/exports/BTE_CASE-0001_Nguyen_Tien_Son_Report_V1_0.docx
+++ b/knowledge/report_v1_validation/exports/BTE_CASE-0001_Nguyen_Tien_Son_Report_V1_0.docx
@@ -17,7 +17,7 @@
     </w:p>
     <w:p>
       <w:r>
-        <w:t>Nguyễn Tiến Sơn · CASE-0001 · 2026-08-12T10:45:53Z</w:t>
+        <w:t>Nguyễn Tiến Sơn · CASE-0001 · 2026-08-13T16:20:54Z</w:t>
       </w:r>
     </w:p>
     <w:p>
@@ -226,6 +226,28 @@
           </w:tcPr>
           <w:p>
             <w:r>
+              <w:t>Can Chi năm âm</w:t>
+            </w:r>
+          </w:p>
+        </w:tc>
+        <w:tc>
+          <w:tcPr>
+            <w:tcW w:type="dxa" w:w="4819"/>
+          </w:tcPr>
+          <w:p>
+            <w:r>
+              <w:t>Bính Dần</w:t>
+            </w:r>
+          </w:p>
+        </w:tc>
+      </w:tr>
+      <w:tr>
+        <w:tc>
+          <w:tcPr>
+            <w:tcW w:type="dxa" w:w="4819"/>
+          </w:tcPr>
+          <w:p>
+            <w:r>
               <w:t>Tiết khí</w:t>
             </w:r>
           </w:p>
@@ -237,6 +259,94 @@
           <w:p>
             <w:r>
               <w:t>Đại Hàn</w:t>
+            </w:r>
+          </w:p>
+        </w:tc>
+      </w:tr>
+      <w:tr>
+        <w:tc>
+          <w:tcPr>
+            <w:tcW w:type="dxa" w:w="4819"/>
+          </w:tcPr>
+          <w:p>
+            <w:r>
+              <w:t>Cung Phi</w:t>
+            </w:r>
+          </w:p>
+        </w:tc>
+        <w:tc>
+          <w:tcPr>
+            <w:tcW w:type="dxa" w:w="4819"/>
+          </w:tcPr>
+          <w:p>
+            <w:r>
+              <w:t>Khôn</w:t>
+            </w:r>
+          </w:p>
+        </w:tc>
+      </w:tr>
+      <w:tr>
+        <w:tc>
+          <w:tcPr>
+            <w:tcW w:type="dxa" w:w="4819"/>
+          </w:tcPr>
+          <w:p>
+            <w:r>
+              <w:t>Mệnh Quái</w:t>
+            </w:r>
+          </w:p>
+        </w:tc>
+        <w:tc>
+          <w:tcPr>
+            <w:tcW w:type="dxa" w:w="4819"/>
+          </w:tcPr>
+          <w:p>
+            <w:r>
+              <w:t>Khôn</w:t>
+            </w:r>
+          </w:p>
+        </w:tc>
+      </w:tr>
+      <w:tr>
+        <w:tc>
+          <w:tcPr>
+            <w:tcW w:type="dxa" w:w="4819"/>
+          </w:tcPr>
+          <w:p>
+            <w:r>
+              <w:t>Nhóm Trạch</w:t>
+            </w:r>
+          </w:p>
+        </w:tc>
+        <w:tc>
+          <w:tcPr>
+            <w:tcW w:type="dxa" w:w="4819"/>
+          </w:tcPr>
+          <w:p>
+            <w:r>
+              <w:t>Tây Tứ Trạch</w:t>
+            </w:r>
+          </w:p>
+        </w:tc>
+      </w:tr>
+      <w:tr>
+        <w:tc>
+          <w:tcPr>
+            <w:tcW w:type="dxa" w:w="4819"/>
+          </w:tcPr>
+          <w:p>
+            <w:r>
+              <w:t>Múi giờ lịch</w:t>
+            </w:r>
+          </w:p>
+        </w:tc>
+        <w:tc>
+          <w:tcPr>
+            <w:tcW w:type="dxa" w:w="4819"/>
+          </w:tcPr>
+          <w:p>
+            <w:r>
+              <w:t>Asia/Bangkok</w:t>
             </w:r>
           </w:p>
         </w:tc>
@@ -583,11 +693,149 @@
         <w:t>03. Ngũ hành</w:t>
       </w:r>
     </w:p>
-    <w:p>
-      <w:r>
-        <w:t>DATA NOT PROVIDED BY RUNTIME</w:t>
-      </w:r>
-    </w:p>
+    <w:tbl>
+      <w:tblPr>
+        <w:tblStyle w:val="TableGrid"/>
+        <w:tblW w:type="auto" w:w="0"/>
+        <w:tblLook w:firstColumn="1" w:firstRow="1" w:lastColumn="0" w:lastRow="0" w:noHBand="0" w:noVBand="1" w:val="04A0"/>
+      </w:tblPr>
+      <w:tblGrid>
+        <w:gridCol w:w="4819"/>
+        <w:gridCol w:w="4819"/>
+      </w:tblGrid>
+      <w:tr>
+        <w:tc>
+          <w:tcPr>
+            <w:tcW w:type="dxa" w:w="4819"/>
+          </w:tcPr>
+          <w:p>
+            <w:r>
+              <w:t>Hành</w:t>
+            </w:r>
+          </w:p>
+        </w:tc>
+        <w:tc>
+          <w:tcPr>
+            <w:tcW w:type="dxa" w:w="4819"/>
+          </w:tcPr>
+          <w:p>
+            <w:r>
+              <w:t>Giá trị</w:t>
+            </w:r>
+          </w:p>
+        </w:tc>
+      </w:tr>
+      <w:tr>
+        <w:tc>
+          <w:tcPr>
+            <w:tcW w:type="dxa" w:w="4819"/>
+          </w:tcPr>
+          <w:p>
+            <w:r>
+              <w:t>Mộc</w:t>
+            </w:r>
+          </w:p>
+        </w:tc>
+        <w:tc>
+          <w:tcPr>
+            <w:tcW w:type="dxa" w:w="4819"/>
+          </w:tcPr>
+          <w:p>
+            <w:r>
+              <w:t>4</w:t>
+            </w:r>
+          </w:p>
+        </w:tc>
+      </w:tr>
+      <w:tr>
+        <w:tc>
+          <w:tcPr>
+            <w:tcW w:type="dxa" w:w="4819"/>
+          </w:tcPr>
+          <w:p>
+            <w:r>
+              <w:t>Hỏa</w:t>
+            </w:r>
+          </w:p>
+        </w:tc>
+        <w:tc>
+          <w:tcPr>
+            <w:tcW w:type="dxa" w:w="4819"/>
+          </w:tcPr>
+          <w:p>
+            <w:r>
+              <w:t>5</w:t>
+            </w:r>
+          </w:p>
+        </w:tc>
+      </w:tr>
+      <w:tr>
+        <w:tc>
+          <w:tcPr>
+            <w:tcW w:type="dxa" w:w="4819"/>
+          </w:tcPr>
+          <w:p>
+            <w:r>
+              <w:t>Thổ</w:t>
+            </w:r>
+          </w:p>
+        </w:tc>
+        <w:tc>
+          <w:tcPr>
+            <w:tcW w:type="dxa" w:w="4819"/>
+          </w:tcPr>
+          <w:p>
+            <w:r>
+              <w:t>6</w:t>
+            </w:r>
+          </w:p>
+        </w:tc>
+      </w:tr>
+      <w:tr>
+        <w:tc>
+          <w:tcPr>
+            <w:tcW w:type="dxa" w:w="4819"/>
+          </w:tcPr>
+          <w:p>
+            <w:r>
+              <w:t>Kim</w:t>
+            </w:r>
+          </w:p>
+        </w:tc>
+        <w:tc>
+          <w:tcPr>
+            <w:tcW w:type="dxa" w:w="4819"/>
+          </w:tcPr>
+          <w:p>
+            <w:r>
+              <w:t>3</w:t>
+            </w:r>
+          </w:p>
+        </w:tc>
+      </w:tr>
+      <w:tr>
+        <w:tc>
+          <w:tcPr>
+            <w:tcW w:type="dxa" w:w="4819"/>
+          </w:tcPr>
+          <w:p>
+            <w:r>
+              <w:t>Thủy</w:t>
+            </w:r>
+          </w:p>
+        </w:tc>
+        <w:tc>
+          <w:tcPr>
+            <w:tcW w:type="dxa" w:w="4819"/>
+          </w:tcPr>
+          <w:p>
+            <w:r>
+              <w:t>1</w:t>
+            </w:r>
+          </w:p>
+        </w:tc>
+      </w:tr>
+    </w:tbl>
     <w:p>
       <w:pPr>
         <w:pStyle w:val="Heading1"/>
@@ -960,7 +1208,7 @@
     </w:tbl>
     <w:p>
       <w:r>
-        <w:t>Trung hòa</w:t>
+        <w:t>Thân vượng</w:t>
       </w:r>
     </w:p>
     <w:p>
@@ -1489,6 +1737,61 @@
         <w:tblLook w:firstColumn="1" w:firstRow="1" w:lastColumn="0" w:lastRow="0" w:noHBand="0" w:noVBand="1" w:val="04A0"/>
       </w:tblPr>
       <w:tblGrid>
+        <w:gridCol w:w="4819"/>
+        <w:gridCol w:w="4819"/>
+      </w:tblGrid>
+      <w:tr>
+        <w:tc>
+          <w:tcPr>
+            <w:tcW w:type="dxa" w:w="4819"/>
+          </w:tcPr>
+          <w:p>
+            <w:r>
+              <w:t>Hướng</w:t>
+            </w:r>
+          </w:p>
+        </w:tc>
+        <w:tc>
+          <w:tcPr>
+            <w:tcW w:type="dxa" w:w="4819"/>
+          </w:tcPr>
+          <w:p>
+            <w:r>
+              <w:t>Thuận</w:t>
+            </w:r>
+          </w:p>
+        </w:tc>
+      </w:tr>
+      <w:tr>
+        <w:tc>
+          <w:tcPr>
+            <w:tcW w:type="dxa" w:w="4819"/>
+          </w:tcPr>
+          <w:p>
+            <w:r>
+              <w:t>Tuổi khởi</w:t>
+            </w:r>
+          </w:p>
+        </w:tc>
+        <w:tc>
+          <w:tcPr>
+            <w:tcW w:type="dxa" w:w="4819"/>
+          </w:tcPr>
+          <w:p>
+            <w:r>
+              <w:t>5</w:t>
+            </w:r>
+          </w:p>
+        </w:tc>
+      </w:tr>
+    </w:tbl>
+    <w:tbl>
+      <w:tblPr>
+        <w:tblStyle w:val="TableGrid"/>
+        <w:tblW w:type="auto" w:w="0"/>
+        <w:tblLook w:firstColumn="1" w:firstRow="1" w:lastColumn="0" w:lastRow="0" w:noHBand="0" w:noVBand="1" w:val="04A0"/>
+      </w:tblPr>
+      <w:tblGrid>
         <w:gridCol w:w="1606"/>
         <w:gridCol w:w="1606"/>
         <w:gridCol w:w="1606"/>
@@ -1565,6 +1868,192 @@
           </w:tcPr>
           <w:p>
             <w:r>
+              <w:t>0</w:t>
+            </w:r>
+          </w:p>
+        </w:tc>
+        <w:tc>
+          <w:tcPr>
+            <w:tcW w:type="dxa" w:w="1606"/>
+          </w:tcPr>
+          <w:p>
+            <w:r>
+              <w:t>Nhâm Dần</w:t>
+            </w:r>
+          </w:p>
+        </w:tc>
+        <w:tc>
+          <w:tcPr>
+            <w:tcW w:type="dxa" w:w="1606"/>
+          </w:tcPr>
+          <w:p>
+            <w:r>
+              <w:t>1992</w:t>
+            </w:r>
+          </w:p>
+        </w:tc>
+        <w:tc>
+          <w:tcPr>
+            <w:tcW w:type="dxa" w:w="1606"/>
+          </w:tcPr>
+          <w:p>
+            <w:r>
+              <w:t>2001</w:t>
+            </w:r>
+          </w:p>
+        </w:tc>
+        <w:tc>
+          <w:tcPr>
+            <w:tcW w:type="dxa" w:w="1606"/>
+          </w:tcPr>
+          <w:p>
+            <w:r>
+              <w:t>5 – 14</w:t>
+            </w:r>
+          </w:p>
+        </w:tc>
+        <w:tc>
+          <w:tcPr>
+            <w:tcW w:type="dxa" w:w="1606"/>
+          </w:tcPr>
+          <w:p>
+            <w:r>
+              <w:t>Nhâm Dần</w:t>
+            </w:r>
+          </w:p>
+        </w:tc>
+      </w:tr>
+      <w:tr>
+        <w:tc>
+          <w:tcPr>
+            <w:tcW w:type="dxa" w:w="1606"/>
+          </w:tcPr>
+          <w:p>
+            <w:r>
+              <w:t>1</w:t>
+            </w:r>
+          </w:p>
+        </w:tc>
+        <w:tc>
+          <w:tcPr>
+            <w:tcW w:type="dxa" w:w="1606"/>
+          </w:tcPr>
+          <w:p>
+            <w:r>
+              <w:t>Quý Mão</w:t>
+            </w:r>
+          </w:p>
+        </w:tc>
+        <w:tc>
+          <w:tcPr>
+            <w:tcW w:type="dxa" w:w="1606"/>
+          </w:tcPr>
+          <w:p>
+            <w:r>
+              <w:t>2002</w:t>
+            </w:r>
+          </w:p>
+        </w:tc>
+        <w:tc>
+          <w:tcPr>
+            <w:tcW w:type="dxa" w:w="1606"/>
+          </w:tcPr>
+          <w:p>
+            <w:r>
+              <w:t>2011</w:t>
+            </w:r>
+          </w:p>
+        </w:tc>
+        <w:tc>
+          <w:tcPr>
+            <w:tcW w:type="dxa" w:w="1606"/>
+          </w:tcPr>
+          <w:p>
+            <w:r>
+              <w:t>15 – 24</w:t>
+            </w:r>
+          </w:p>
+        </w:tc>
+        <w:tc>
+          <w:tcPr>
+            <w:tcW w:type="dxa" w:w="1606"/>
+          </w:tcPr>
+          <w:p>
+            <w:r>
+              <w:t>Quý Mão</w:t>
+            </w:r>
+          </w:p>
+        </w:tc>
+      </w:tr>
+      <w:tr>
+        <w:tc>
+          <w:tcPr>
+            <w:tcW w:type="dxa" w:w="1606"/>
+          </w:tcPr>
+          <w:p>
+            <w:r>
+              <w:t>2</w:t>
+            </w:r>
+          </w:p>
+        </w:tc>
+        <w:tc>
+          <w:tcPr>
+            <w:tcW w:type="dxa" w:w="1606"/>
+          </w:tcPr>
+          <w:p>
+            <w:r>
+              <w:t>Giáp Thìn</w:t>
+            </w:r>
+          </w:p>
+        </w:tc>
+        <w:tc>
+          <w:tcPr>
+            <w:tcW w:type="dxa" w:w="1606"/>
+          </w:tcPr>
+          <w:p>
+            <w:r>
+              <w:t>2012</w:t>
+            </w:r>
+          </w:p>
+        </w:tc>
+        <w:tc>
+          <w:tcPr>
+            <w:tcW w:type="dxa" w:w="1606"/>
+          </w:tcPr>
+          <w:p>
+            <w:r>
+              <w:t>2021</w:t>
+            </w:r>
+          </w:p>
+        </w:tc>
+        <w:tc>
+          <w:tcPr>
+            <w:tcW w:type="dxa" w:w="1606"/>
+          </w:tcPr>
+          <w:p>
+            <w:r>
+              <w:t>25 – 34</w:t>
+            </w:r>
+          </w:p>
+        </w:tc>
+        <w:tc>
+          <w:tcPr>
+            <w:tcW w:type="dxa" w:w="1606"/>
+          </w:tcPr>
+          <w:p>
+            <w:r>
+              <w:t>Giáp Thìn</w:t>
+            </w:r>
+          </w:p>
+        </w:tc>
+      </w:tr>
+      <w:tr>
+        <w:tc>
+          <w:tcPr>
+            <w:tcW w:type="dxa" w:w="1606"/>
+          </w:tcPr>
+          <w:p>
+            <w:r>
               <w:t>3</w:t>
             </w:r>
           </w:p>
@@ -1616,6 +2105,378 @@
           <w:p>
             <w:r>
               <w:t>Ất Tỵ</w:t>
+            </w:r>
+          </w:p>
+        </w:tc>
+      </w:tr>
+      <w:tr>
+        <w:tc>
+          <w:tcPr>
+            <w:tcW w:type="dxa" w:w="1606"/>
+          </w:tcPr>
+          <w:p>
+            <w:r>
+              <w:t>4</w:t>
+            </w:r>
+          </w:p>
+        </w:tc>
+        <w:tc>
+          <w:tcPr>
+            <w:tcW w:type="dxa" w:w="1606"/>
+          </w:tcPr>
+          <w:p>
+            <w:r>
+              <w:t>Bính Ngọ</w:t>
+            </w:r>
+          </w:p>
+        </w:tc>
+        <w:tc>
+          <w:tcPr>
+            <w:tcW w:type="dxa" w:w="1606"/>
+          </w:tcPr>
+          <w:p>
+            <w:r>
+              <w:t>2032</w:t>
+            </w:r>
+          </w:p>
+        </w:tc>
+        <w:tc>
+          <w:tcPr>
+            <w:tcW w:type="dxa" w:w="1606"/>
+          </w:tcPr>
+          <w:p>
+            <w:r>
+              <w:t>2041</w:t>
+            </w:r>
+          </w:p>
+        </w:tc>
+        <w:tc>
+          <w:tcPr>
+            <w:tcW w:type="dxa" w:w="1606"/>
+          </w:tcPr>
+          <w:p>
+            <w:r>
+              <w:t>45 – 54</w:t>
+            </w:r>
+          </w:p>
+        </w:tc>
+        <w:tc>
+          <w:tcPr>
+            <w:tcW w:type="dxa" w:w="1606"/>
+          </w:tcPr>
+          <w:p>
+            <w:r>
+              <w:t>Bính Ngọ</w:t>
+            </w:r>
+          </w:p>
+        </w:tc>
+      </w:tr>
+      <w:tr>
+        <w:tc>
+          <w:tcPr>
+            <w:tcW w:type="dxa" w:w="1606"/>
+          </w:tcPr>
+          <w:p>
+            <w:r>
+              <w:t>5</w:t>
+            </w:r>
+          </w:p>
+        </w:tc>
+        <w:tc>
+          <w:tcPr>
+            <w:tcW w:type="dxa" w:w="1606"/>
+          </w:tcPr>
+          <w:p>
+            <w:r>
+              <w:t>Đinh Mùi</w:t>
+            </w:r>
+          </w:p>
+        </w:tc>
+        <w:tc>
+          <w:tcPr>
+            <w:tcW w:type="dxa" w:w="1606"/>
+          </w:tcPr>
+          <w:p>
+            <w:r>
+              <w:t>2042</w:t>
+            </w:r>
+          </w:p>
+        </w:tc>
+        <w:tc>
+          <w:tcPr>
+            <w:tcW w:type="dxa" w:w="1606"/>
+          </w:tcPr>
+          <w:p>
+            <w:r>
+              <w:t>2051</w:t>
+            </w:r>
+          </w:p>
+        </w:tc>
+        <w:tc>
+          <w:tcPr>
+            <w:tcW w:type="dxa" w:w="1606"/>
+          </w:tcPr>
+          <w:p>
+            <w:r>
+              <w:t>55 – 64</w:t>
+            </w:r>
+          </w:p>
+        </w:tc>
+        <w:tc>
+          <w:tcPr>
+            <w:tcW w:type="dxa" w:w="1606"/>
+          </w:tcPr>
+          <w:p>
+            <w:r>
+              <w:t>Đinh Mùi</w:t>
+            </w:r>
+          </w:p>
+        </w:tc>
+      </w:tr>
+      <w:tr>
+        <w:tc>
+          <w:tcPr>
+            <w:tcW w:type="dxa" w:w="1606"/>
+          </w:tcPr>
+          <w:p>
+            <w:r>
+              <w:t>6</w:t>
+            </w:r>
+          </w:p>
+        </w:tc>
+        <w:tc>
+          <w:tcPr>
+            <w:tcW w:type="dxa" w:w="1606"/>
+          </w:tcPr>
+          <w:p>
+            <w:r>
+              <w:t>Mậu Thân</w:t>
+            </w:r>
+          </w:p>
+        </w:tc>
+        <w:tc>
+          <w:tcPr>
+            <w:tcW w:type="dxa" w:w="1606"/>
+          </w:tcPr>
+          <w:p>
+            <w:r>
+              <w:t>2052</w:t>
+            </w:r>
+          </w:p>
+        </w:tc>
+        <w:tc>
+          <w:tcPr>
+            <w:tcW w:type="dxa" w:w="1606"/>
+          </w:tcPr>
+          <w:p>
+            <w:r>
+              <w:t>2061</w:t>
+            </w:r>
+          </w:p>
+        </w:tc>
+        <w:tc>
+          <w:tcPr>
+            <w:tcW w:type="dxa" w:w="1606"/>
+          </w:tcPr>
+          <w:p>
+            <w:r>
+              <w:t>65 – 74</w:t>
+            </w:r>
+          </w:p>
+        </w:tc>
+        <w:tc>
+          <w:tcPr>
+            <w:tcW w:type="dxa" w:w="1606"/>
+          </w:tcPr>
+          <w:p>
+            <w:r>
+              <w:t>Mậu Thân</w:t>
+            </w:r>
+          </w:p>
+        </w:tc>
+      </w:tr>
+      <w:tr>
+        <w:tc>
+          <w:tcPr>
+            <w:tcW w:type="dxa" w:w="1606"/>
+          </w:tcPr>
+          <w:p>
+            <w:r>
+              <w:t>7</w:t>
+            </w:r>
+          </w:p>
+        </w:tc>
+        <w:tc>
+          <w:tcPr>
+            <w:tcW w:type="dxa" w:w="1606"/>
+          </w:tcPr>
+          <w:p>
+            <w:r>
+              <w:t>Kỷ Dậu</w:t>
+            </w:r>
+          </w:p>
+        </w:tc>
+        <w:tc>
+          <w:tcPr>
+            <w:tcW w:type="dxa" w:w="1606"/>
+          </w:tcPr>
+          <w:p>
+            <w:r>
+              <w:t>2062</w:t>
+            </w:r>
+          </w:p>
+        </w:tc>
+        <w:tc>
+          <w:tcPr>
+            <w:tcW w:type="dxa" w:w="1606"/>
+          </w:tcPr>
+          <w:p>
+            <w:r>
+              <w:t>2071</w:t>
+            </w:r>
+          </w:p>
+        </w:tc>
+        <w:tc>
+          <w:tcPr>
+            <w:tcW w:type="dxa" w:w="1606"/>
+          </w:tcPr>
+          <w:p>
+            <w:r>
+              <w:t>75 – 84</w:t>
+            </w:r>
+          </w:p>
+        </w:tc>
+        <w:tc>
+          <w:tcPr>
+            <w:tcW w:type="dxa" w:w="1606"/>
+          </w:tcPr>
+          <w:p>
+            <w:r>
+              <w:t>Kỷ Dậu</w:t>
+            </w:r>
+          </w:p>
+        </w:tc>
+      </w:tr>
+      <w:tr>
+        <w:tc>
+          <w:tcPr>
+            <w:tcW w:type="dxa" w:w="1606"/>
+          </w:tcPr>
+          <w:p>
+            <w:r>
+              <w:t>8</w:t>
+            </w:r>
+          </w:p>
+        </w:tc>
+        <w:tc>
+          <w:tcPr>
+            <w:tcW w:type="dxa" w:w="1606"/>
+          </w:tcPr>
+          <w:p>
+            <w:r>
+              <w:t>Canh Tuất</w:t>
+            </w:r>
+          </w:p>
+        </w:tc>
+        <w:tc>
+          <w:tcPr>
+            <w:tcW w:type="dxa" w:w="1606"/>
+          </w:tcPr>
+          <w:p>
+            <w:r>
+              <w:t>2072</w:t>
+            </w:r>
+          </w:p>
+        </w:tc>
+        <w:tc>
+          <w:tcPr>
+            <w:tcW w:type="dxa" w:w="1606"/>
+          </w:tcPr>
+          <w:p>
+            <w:r>
+              <w:t>2081</w:t>
+            </w:r>
+          </w:p>
+        </w:tc>
+        <w:tc>
+          <w:tcPr>
+            <w:tcW w:type="dxa" w:w="1606"/>
+          </w:tcPr>
+          <w:p>
+            <w:r>
+              <w:t>85 – 94</w:t>
+            </w:r>
+          </w:p>
+        </w:tc>
+        <w:tc>
+          <w:tcPr>
+            <w:tcW w:type="dxa" w:w="1606"/>
+          </w:tcPr>
+          <w:p>
+            <w:r>
+              <w:t>Canh Tuất</w:t>
+            </w:r>
+          </w:p>
+        </w:tc>
+      </w:tr>
+      <w:tr>
+        <w:tc>
+          <w:tcPr>
+            <w:tcW w:type="dxa" w:w="1606"/>
+          </w:tcPr>
+          <w:p>
+            <w:r>
+              <w:t>9</w:t>
+            </w:r>
+          </w:p>
+        </w:tc>
+        <w:tc>
+          <w:tcPr>
+            <w:tcW w:type="dxa" w:w="1606"/>
+          </w:tcPr>
+          <w:p>
+            <w:r>
+              <w:t>Tân Hợi</w:t>
+            </w:r>
+          </w:p>
+        </w:tc>
+        <w:tc>
+          <w:tcPr>
+            <w:tcW w:type="dxa" w:w="1606"/>
+          </w:tcPr>
+          <w:p>
+            <w:r>
+              <w:t>2082</w:t>
+            </w:r>
+          </w:p>
+        </w:tc>
+        <w:tc>
+          <w:tcPr>
+            <w:tcW w:type="dxa" w:w="1606"/>
+          </w:tcPr>
+          <w:p>
+            <w:r>
+              <w:t>2091</w:t>
+            </w:r>
+          </w:p>
+        </w:tc>
+        <w:tc>
+          <w:tcPr>
+            <w:tcW w:type="dxa" w:w="1606"/>
+          </w:tcPr>
+          <w:p>
+            <w:r>
+              <w:t>95 – 104</w:t>
+            </w:r>
+          </w:p>
+        </w:tc>
+        <w:tc>
+          <w:tcPr>
+            <w:tcW w:type="dxa" w:w="1606"/>
+          </w:tcPr>
+          <w:p>
+            <w:r>
+              <w:t>Tân Hợi</w:t>
             </w:r>
           </w:p>
         </w:tc>

</xml_diff>

<commit_message>
Localize portal test expectations
Update the customer portal desktop tests to match the frozen Vietnamese UI copy and localized labels, including priority, interpretation, and recommendation strings. Also relax the canonical adapter assertions so translated deity names are validated with substring matching instead of exact English titles. This keeps the tests aligned with the localized product copy.
</commit_message>
<xml_diff>
--- a/knowledge/report_v1_validation/exports/BTE_CASE-0001_Nguyen_Tien_Son_Report_V1_0.docx
+++ b/knowledge/report_v1_validation/exports/BTE_CASE-0001_Nguyen_Tien_Son_Report_V1_0.docx
@@ -17,7 +17,7 @@
     </w:p>
     <w:p>
       <w:r>
-        <w:t>Nguyễn Tiến Sơn · CASE-0001 · 2026-08-13T16:20:54Z</w:t>
+        <w:t>Nguyễn Tiến Sơn · CASE-0001 · 2026-08-20T14:28:58Z</w:t>
       </w:r>
     </w:p>
     <w:p>
@@ -148,7 +148,7 @@
           </w:tcPr>
           <w:p>
             <w:r>
-              <w:t>Hà Tây, Việt Nam</w:t>
+              <w:t>Hà Tây · Việt Nam</w:t>
             </w:r>
           </w:p>
         </w:tc>
@@ -463,7 +463,7 @@
           </w:tcPr>
           <w:p>
             <w:r>
-              <w:t>Giáp, Bính, Mậu</w:t>
+              <w:t>Giáp · Mộc · Thiên Tài · Bính · Hỏa · Thất Sát · Mậu · Thổ · Thiên Ấn</w:t>
             </w:r>
           </w:p>
         </w:tc>
@@ -525,7 +525,7 @@
           </w:tcPr>
           <w:p>
             <w:r>
-              <w:t>Kỷ, Quý, Tân</w:t>
+              <w:t>Kỷ · Thổ · Chính Ấn · Quý · Thủy · Thương Quan · Tân · Kim · Kiếp Tài</w:t>
             </w:r>
           </w:p>
         </w:tc>
@@ -587,7 +587,7 @@
           </w:tcPr>
           <w:p>
             <w:r>
-              <w:t>Đinh, Kỷ</w:t>
+              <w:t>Đinh · Hỏa · Chính Quan · Kỷ · Thổ · Chính Ấn</w:t>
             </w:r>
           </w:p>
         </w:tc>
@@ -649,7 +649,7 @@
           </w:tcPr>
           <w:p>
             <w:r>
-              <w:t>Giáp, Bính, Mậu</w:t>
+              <w:t>Giáp · Mộc · Thiên Tài · Bính · Hỏa · Thất Sát · Mậu · Thổ · Thiên Ấn</w:t>
             </w:r>
           </w:p>
         </w:tc>
@@ -690,7 +690,7 @@
         <w:pStyle w:val="Heading1"/>
       </w:pPr>
       <w:r>
-        <w:t>03. Ngũ hành</w:t>
+        <w:t>03. Phân bố Ngũ hành</w:t>
       </w:r>
     </w:p>
     <w:tbl>
@@ -720,7 +720,7 @@
           </w:tcPr>
           <w:p>
             <w:r>
-              <w:t>Giá trị</w:t>
+              <w:t>Số đơn vị</w:t>
             </w:r>
           </w:p>
         </w:tc>
@@ -836,6 +836,21 @@
         </w:tc>
       </w:tr>
     </w:tbl>
+    <w:p>
+      <w:r>
+        <w:t>Tính theo Thiên can · bản hành Địa chi · Tàng can</w:t>
+      </w:r>
+    </w:p>
+    <w:p>
+      <w:r>
+        <w:t>Tổng đơn vị cấu trúc: 19</w:t>
+      </w:r>
+    </w:p>
+    <w:p>
+      <w:r>
+        <w:t>Phân bố Ngũ hành phản ánh số lần xuất hiện trong cấu trúc, không phải mức vượng suy và không trực tiếp quyết định Dụng thần.</w:t>
+      </w:r>
+    </w:p>
     <w:p>
       <w:pPr>
         <w:pStyle w:val="Heading1"/>
@@ -1017,7 +1032,7 @@
           </w:tcPr>
           <w:p>
             <w:r>
-              <w:t>Thập thần hiển</w:t>
+              <w:t>Thiên Ấn — Lộ rõ</w:t>
             </w:r>
           </w:p>
         </w:tc>
@@ -1027,7 +1042,7 @@
           </w:tcPr>
           <w:p>
             <w:r>
-              <w:t>Thất Sát, Kiếp Tài, Nhật Chủ, Thiên Ấn</w:t>
+              <w:t>Mậu lộ trụ Giờ · đồng thời có tàng</w:t>
             </w:r>
           </w:p>
         </w:tc>
@@ -1039,7 +1054,7 @@
           </w:tcPr>
           <w:p>
             <w:r>
-              <w:t>Ẩn can</w:t>
+              <w:t>Thất Sát — Lộ rõ</w:t>
             </w:r>
           </w:p>
         </w:tc>
@@ -1049,7 +1064,7 @@
           </w:tcPr>
           <w:p>
             <w:r>
-              <w:t>Giáp, Bính, Mậu, Kỷ, Quý, Tân, Đinh, Kỷ, Giáp, Bính, Mậu</w:t>
+              <w:t>Bính lộ trụ Năm · đồng thời có tàng</w:t>
             </w:r>
           </w:p>
         </w:tc>
@@ -1061,7 +1076,7 @@
           </w:tcPr>
           <w:p>
             <w:r>
-              <w:t>Tóm tắt</w:t>
+              <w:t>Kiếp Tài — Lộ rõ</w:t>
             </w:r>
           </w:p>
         </w:tc>
@@ -1071,7 +1086,183 @@
           </w:tcPr>
           <w:p>
             <w:r>
-              <w:t>Thất Sát, Kiếp Tài, Nhật Chủ, Thiên Ấn</w:t>
+              <w:t>Tân lộ trụ Tháng · đồng thời có tàng</w:t>
+            </w:r>
+          </w:p>
+        </w:tc>
+      </w:tr>
+      <w:tr>
+        <w:tc>
+          <w:tcPr>
+            <w:tcW w:type="dxa" w:w="4819"/>
+          </w:tcPr>
+          <w:p>
+            <w:r>
+              <w:t>Chính Ấn — Ẩn nổi bật</w:t>
+            </w:r>
+          </w:p>
+        </w:tc>
+        <w:tc>
+          <w:tcPr>
+            <w:tcW w:type="dxa" w:w="4819"/>
+          </w:tcPr>
+          <w:p>
+            <w:r>
+              <w:t>Kỷ xuất hiện lặp trong tàng can (Tháng · Ngày)</w:t>
+            </w:r>
+          </w:p>
+        </w:tc>
+      </w:tr>
+      <w:tr>
+        <w:tc>
+          <w:tcPr>
+            <w:tcW w:type="dxa" w:w="4819"/>
+          </w:tcPr>
+          <w:p>
+            <w:r>
+              <w:t>Thiên Tài — Ẩn nổi bật</w:t>
+            </w:r>
+          </w:p>
+        </w:tc>
+        <w:tc>
+          <w:tcPr>
+            <w:tcW w:type="dxa" w:w="4819"/>
+          </w:tcPr>
+          <w:p>
+            <w:r>
+              <w:t>Giáp xuất hiện tại 2 chi Dần</w:t>
+            </w:r>
+          </w:p>
+        </w:tc>
+      </w:tr>
+      <w:tr>
+        <w:tc>
+          <w:tcPr>
+            <w:tcW w:type="dxa" w:w="4819"/>
+          </w:tcPr>
+          <w:p>
+            <w:r>
+              <w:t>Lộ can</w:t>
+            </w:r>
+          </w:p>
+        </w:tc>
+        <w:tc>
+          <w:tcPr>
+            <w:tcW w:type="dxa" w:w="4819"/>
+          </w:tcPr>
+          <w:p>
+            <w:r>
+              <w:t>Bính · Hỏa / Thất Sát · Tân · Kim / Kiếp Tài · Canh · Kim / Nhật Chủ · Mậu · Thổ / Thiên Ấn</w:t>
+            </w:r>
+          </w:p>
+        </w:tc>
+      </w:tr>
+      <w:tr>
+        <w:tc>
+          <w:tcPr>
+            <w:tcW w:type="dxa" w:w="4819"/>
+          </w:tcPr>
+          <w:p>
+            <w:r>
+              <w:t>Tàng can</w:t>
+            </w:r>
+          </w:p>
+        </w:tc>
+        <w:tc>
+          <w:tcPr>
+            <w:tcW w:type="dxa" w:w="4819"/>
+          </w:tcPr>
+          <w:p>
+            <w:r>
+              <w:t>Giáp · Mộc · Thiên Tài · Bính · Hỏa · Thất Sát · Mậu · Thổ · Thiên Ấn · Kỷ · Thổ · Chính Ấn · Quý · Thủy · Thương Quan · Tân · Kim · Kiếp Tài · Đinh · Hỏa · Chính Quan · Kỷ · Thổ · Chính Ấn · Giáp · Mộc · Thiên Tài · Bính · Hỏa · Thất Sát · Mậu · Thổ · Thiên Ấn</w:t>
+            </w:r>
+          </w:p>
+        </w:tc>
+      </w:tr>
+      <w:tr>
+        <w:tc>
+          <w:tcPr>
+            <w:tcW w:type="dxa" w:w="4819"/>
+          </w:tcPr>
+          <w:p>
+            <w:r>
+              <w:t>Tóm tắt lộ</w:t>
+            </w:r>
+          </w:p>
+        </w:tc>
+        <w:tc>
+          <w:tcPr>
+            <w:tcW w:type="dxa" w:w="4819"/>
+          </w:tcPr>
+          <w:p>
+            <w:r>
+              <w:t>Thất Sát · Kiếp Tài · Nhật Chủ · Thiên Ấn</w:t>
+            </w:r>
+          </w:p>
+        </w:tc>
+      </w:tr>
+      <w:tr>
+        <w:tc>
+          <w:tcPr>
+            <w:tcW w:type="dxa" w:w="4819"/>
+          </w:tcPr>
+          <w:p>
+            <w:r>
+              <w:t>Tóm tắt tàng</w:t>
+            </w:r>
+          </w:p>
+        </w:tc>
+        <w:tc>
+          <w:tcPr>
+            <w:tcW w:type="dxa" w:w="4819"/>
+          </w:tcPr>
+          <w:p>
+            <w:r>
+              <w:t>Thiên Tài · Thất Sát · Thiên Ấn · Chính Ấn · Thương Quan · Kiếp Tài · Chính Quan</w:t>
+            </w:r>
+          </w:p>
+        </w:tc>
+      </w:tr>
+      <w:tr>
+        <w:tc>
+          <w:tcPr>
+            <w:tcW w:type="dxa" w:w="4819"/>
+          </w:tcPr>
+          <w:p>
+            <w:r>
+              <w:t>Các thần khác</w:t>
+            </w:r>
+          </w:p>
+        </w:tc>
+        <w:tc>
+          <w:tcPr>
+            <w:tcW w:type="dxa" w:w="4819"/>
+          </w:tcPr>
+          <w:p>
+            <w:r>
+              <w:t>Chính Quan · Thương Quan</w:t>
+            </w:r>
+          </w:p>
+        </w:tc>
+      </w:tr>
+      <w:tr>
+        <w:tc>
+          <w:tcPr>
+            <w:tcW w:type="dxa" w:w="4819"/>
+          </w:tcPr>
+          <w:p>
+            <w:r>
+              <w:t>Ghi chú</w:t>
+            </w:r>
+          </w:p>
+        </w:tc>
+        <w:tc>
+          <w:tcPr>
+            <w:tcW w:type="dxa" w:w="4819"/>
+          </w:tcPr>
+          <w:p>
+            <w:r>
+              <w:t>Xác định theo quan hệ Ngũ hành và âm dương với Nhật chủ.</w:t>
             </w:r>
           </w:p>
         </w:tc>
@@ -1246,7 +1437,29 @@
           </w:tcPr>
           <w:p>
             <w:r>
-              <w:t>Thực Thần</w:t>
+              <w:t>Hỏa · Đinh · Chính Quan</w:t>
+            </w:r>
+          </w:p>
+        </w:tc>
+      </w:tr>
+      <w:tr>
+        <w:tc>
+          <w:tcPr>
+            <w:tcW w:type="dxa" w:w="4819"/>
+          </w:tcPr>
+          <w:p>
+            <w:r>
+              <w:t>Căn cứ chọn Dụng</w:t>
+            </w:r>
+          </w:p>
+        </w:tc>
+        <w:tc>
+          <w:tcPr>
+            <w:tcW w:type="dxa" w:w="4819"/>
+          </w:tcPr>
+          <w:p>
+            <w:r>
+              <w:t>Nhật chủ Canh Kim thân vượng → có Chính Quan đủ điều kiện Chế → áp dụng nguyên tắc Chế theo mô hình cân bằng V1.0 → Hỏa khắc Kim → Đinh đối với Canh là Chính Quan → chọn Hỏa · Đinh · Chính Quan làm Dụng.</w:t>
             </w:r>
           </w:p>
         </w:tc>
@@ -1268,7 +1481,7 @@
           </w:tcPr>
           <w:p>
             <w:r>
-              <w:t>Thực Thần, Thương Quan</w:t>
+              <w:t>Chưa đủ căn cứ xác định Hỷ thần bổ trợ riêng</w:t>
             </w:r>
           </w:p>
         </w:tc>
@@ -1290,7 +1503,29 @@
           </w:tcPr>
           <w:p>
             <w:r>
-              <w:t>Tỷ Kiên, Kiếp Tài</w:t>
+              <w:t>Kim · Canh · Tỷ Kiên / Kim · Tân · Kiếp Tài</w:t>
+            </w:r>
+          </w:p>
+        </w:tc>
+      </w:tr>
+      <w:tr>
+        <w:tc>
+          <w:tcPr>
+            <w:tcW w:type="dxa" w:w="4819"/>
+          </w:tcPr>
+          <w:p>
+            <w:r>
+              <w:t>Phạm vi Kỵ</w:t>
+            </w:r>
+          </w:p>
+        </w:tc>
+        <w:tc>
+          <w:tcPr>
+            <w:tcW w:type="dxa" w:w="4819"/>
+          </w:tcPr>
+          <w:p>
+            <w:r>
+              <w:t>Kỵ thần theo quy tắc cân bằng hiện tại</w:t>
             </w:r>
           </w:p>
         </w:tc>
@@ -1312,17 +1547,100 @@
           </w:tcPr>
           <w:p>
             <w:r>
-              <w:t>Nhiệt</w:t>
+              <w:t>Hàn</w:t>
+            </w:r>
+          </w:p>
+        </w:tc>
+      </w:tr>
+      <w:tr>
+        <w:tc>
+          <w:tcPr>
+            <w:tcW w:type="dxa" w:w="4819"/>
+          </w:tcPr>
+          <w:p>
+            <w:r>
+              <w:t>Nhu cầu điều hòa</w:t>
+            </w:r>
+          </w:p>
+        </w:tc>
+        <w:tc>
+          <w:tcPr>
+            <w:tcW w:type="dxa" w:w="4819"/>
+          </w:tcPr>
+          <w:p>
+            <w:r>
+              <w:t>Cần ôn ấm</w:t>
+            </w:r>
+          </w:p>
+        </w:tc>
+      </w:tr>
+      <w:tr>
+        <w:tc>
+          <w:tcPr>
+            <w:tcW w:type="dxa" w:w="4819"/>
+          </w:tcPr>
+          <w:p>
+            <w:r>
+              <w:t>Ứng dụng Điều hậu</w:t>
+            </w:r>
+          </w:p>
+        </w:tc>
+        <w:tc>
+          <w:tcPr>
+            <w:tcW w:type="dxa" w:w="4819"/>
+          </w:tcPr>
+          <w:p>
+            <w:r>
+              <w:t>Hỏa · Bính · Thất Sát</w:t>
+            </w:r>
+          </w:p>
+        </w:tc>
+      </w:tr>
+      <w:tr>
+        <w:tc>
+          <w:tcPr>
+            <w:tcW w:type="dxa" w:w="4819"/>
+          </w:tcPr>
+          <w:p>
+            <w:r>
+              <w:t>Điều hậu</w:t>
+            </w:r>
+          </w:p>
+        </w:tc>
+        <w:tc>
+          <w:tcPr>
+            <w:tcW w:type="dxa" w:w="4819"/>
+          </w:tcPr>
+          <w:p>
+            <w:r>
+              <w:t>Sinh tháng Sửu, khí mùa Đông thiên hàn.</w:t>
+            </w:r>
+          </w:p>
+        </w:tc>
+      </w:tr>
+      <w:tr>
+        <w:tc>
+          <w:tcPr>
+            <w:tcW w:type="dxa" w:w="4819"/>
+          </w:tcPr>
+          <w:p>
+            <w:r>
+              <w:t>Điều hậu ưu tiên</w:t>
+            </w:r>
+          </w:p>
+        </w:tc>
+        <w:tc>
+          <w:tcPr>
+            <w:tcW w:type="dxa" w:w="4819"/>
+          </w:tcPr>
+          <w:p>
+            <w:r>
+              <w:t>Điều hậu ưu tiên Hỏa</w:t>
             </w:r>
           </w:p>
         </w:tc>
       </w:tr>
     </w:tbl>
-    <w:p>
-      <w:r>
-        <w:t>Than vượng cần tiết khí</w:t>
-      </w:r>
-    </w:p>
     <w:p>
       <w:pPr>
         <w:pStyle w:val="Heading1"/>
@@ -1338,15 +1656,14 @@
         <w:tblLook w:firstColumn="1" w:firstRow="1" w:lastColumn="0" w:lastRow="0" w:noHBand="0" w:noVBand="1" w:val="04A0"/>
       </w:tblPr>
       <w:tblGrid>
-        <w:gridCol w:w="2409"/>
-        <w:gridCol w:w="2409"/>
-        <w:gridCol w:w="2409"/>
-        <w:gridCol w:w="2409"/>
+        <w:gridCol w:w="3213"/>
+        <w:gridCol w:w="3213"/>
+        <w:gridCol w:w="3213"/>
       </w:tblGrid>
       <w:tr>
         <w:tc>
           <w:tcPr>
-            <w:tcW w:type="dxa" w:w="2409"/>
+            <w:tcW w:type="dxa" w:w="3213"/>
           </w:tcPr>
           <w:p>
             <w:r>
@@ -1356,17 +1673,7 @@
         </w:tc>
         <w:tc>
           <w:tcPr>
-            <w:tcW w:type="dxa" w:w="2409"/>
-          </w:tcPr>
-          <w:p>
-            <w:r>
-              <w:t>Loại</w:t>
-            </w:r>
-          </w:p>
-        </w:tc>
-        <w:tc>
-          <w:tcPr>
-            <w:tcW w:type="dxa" w:w="2409"/>
+            <w:tcW w:type="dxa" w:w="3213"/>
           </w:tcPr>
           <w:p>
             <w:r>
@@ -1376,11 +1683,11 @@
         </w:tc>
         <w:tc>
           <w:tcPr>
-            <w:tcW w:type="dxa" w:w="2409"/>
+            <w:tcW w:type="dxa" w:w="3213"/>
           </w:tcPr>
           <w:p>
             <w:r>
-              <w:t>Bằng chứng</w:t>
+              <w:t>Vị trí</w:t>
             </w:r>
           </w:p>
         </w:tc>
@@ -1388,7 +1695,7 @@
       <w:tr>
         <w:tc>
           <w:tcPr>
-            <w:tcW w:type="dxa" w:w="2409"/>
+            <w:tcW w:type="dxa" w:w="3213"/>
           </w:tcPr>
           <w:p>
             <w:r>
@@ -1398,17 +1705,7 @@
         </w:tc>
         <w:tc>
           <w:tcPr>
-            <w:tcW w:type="dxa" w:w="2409"/>
-          </w:tcPr>
-          <w:p>
-            <w:r>
-              <w:t>Thần sát</w:t>
-            </w:r>
-          </w:p>
-        </w:tc>
-        <w:tc>
-          <w:tcPr>
-            <w:tcW w:type="dxa" w:w="2409"/>
+            <w:tcW w:type="dxa" w:w="3213"/>
           </w:tcPr>
           <w:p>
             <w:r>
@@ -1418,11 +1715,11 @@
         </w:tc>
         <w:tc>
           <w:tcPr>
-            <w:tcW w:type="dxa" w:w="2409"/>
+            <w:tcW w:type="dxa" w:w="3213"/>
           </w:tcPr>
           <w:p>
             <w:r>
-              <w:t>Thiên Ất Quý Nhân</w:t>
+              <w:t>Có tại trụ Tháng</w:t>
             </w:r>
           </w:p>
         </w:tc>
@@ -1430,27 +1727,17 @@
       <w:tr>
         <w:tc>
           <w:tcPr>
-            <w:tcW w:type="dxa" w:w="2409"/>
+            <w:tcW w:type="dxa" w:w="3213"/>
           </w:tcPr>
           <w:p>
             <w:r>
-              <w:t>Thiên Ất</w:t>
+              <w:t>Hồng Loan</w:t>
             </w:r>
           </w:p>
         </w:tc>
         <w:tc>
           <w:tcPr>
-            <w:tcW w:type="dxa" w:w="2409"/>
-          </w:tcPr>
-          <w:p>
-            <w:r>
-              <w:t>Thần sát</w:t>
-            </w:r>
-          </w:p>
-        </w:tc>
-        <w:tc>
-          <w:tcPr>
-            <w:tcW w:type="dxa" w:w="2409"/>
+            <w:tcW w:type="dxa" w:w="3213"/>
           </w:tcPr>
           <w:p>
             <w:r>
@@ -1460,11 +1747,11 @@
         </w:tc>
         <w:tc>
           <w:tcPr>
-            <w:tcW w:type="dxa" w:w="2409"/>
+            <w:tcW w:type="dxa" w:w="3213"/>
           </w:tcPr>
           <w:p>
             <w:r>
-              <w:t>Thiên Ất</w:t>
+              <w:t>Có tại trụ Tháng</w:t>
             </w:r>
           </w:p>
         </w:tc>
@@ -1472,27 +1759,17 @@
       <w:tr>
         <w:tc>
           <w:tcPr>
-            <w:tcW w:type="dxa" w:w="2409"/>
+            <w:tcW w:type="dxa" w:w="3213"/>
           </w:tcPr>
           <w:p>
             <w:r>
-              <w:t>Hồng Loan</w:t>
+              <w:t>Thiên Đức Quý Nhân</w:t>
             </w:r>
           </w:p>
         </w:tc>
         <w:tc>
           <w:tcPr>
-            <w:tcW w:type="dxa" w:w="2409"/>
-          </w:tcPr>
-          <w:p>
-            <w:r>
-              <w:t>Thần sát</w:t>
-            </w:r>
-          </w:p>
-        </w:tc>
-        <w:tc>
-          <w:tcPr>
-            <w:tcW w:type="dxa" w:w="2409"/>
+            <w:tcW w:type="dxa" w:w="3213"/>
           </w:tcPr>
           <w:p>
             <w:r>
@@ -1502,11 +1779,11 @@
         </w:tc>
         <w:tc>
           <w:tcPr>
-            <w:tcW w:type="dxa" w:w="2409"/>
+            <w:tcW w:type="dxa" w:w="3213"/>
           </w:tcPr>
           <w:p>
             <w:r>
-              <w:t>Hồng Loan</w:t>
+              <w:t>Có tại trụ Ngày</w:t>
             </w:r>
           </w:p>
         </w:tc>
@@ -1514,27 +1791,17 @@
       <w:tr>
         <w:tc>
           <w:tcPr>
-            <w:tcW w:type="dxa" w:w="2409"/>
+            <w:tcW w:type="dxa" w:w="3213"/>
           </w:tcPr>
           <w:p>
             <w:r>
-              <w:t>Thiên Hỷ</w:t>
+              <w:t>Nguyệt Đức Quý Nhân</w:t>
             </w:r>
           </w:p>
         </w:tc>
         <w:tc>
           <w:tcPr>
-            <w:tcW w:type="dxa" w:w="2409"/>
-          </w:tcPr>
-          <w:p>
-            <w:r>
-              <w:t>Thần sát</w:t>
-            </w:r>
-          </w:p>
-        </w:tc>
-        <w:tc>
-          <w:tcPr>
-            <w:tcW w:type="dxa" w:w="2409"/>
+            <w:tcW w:type="dxa" w:w="3213"/>
           </w:tcPr>
           <w:p>
             <w:r>
@@ -1544,179 +1811,11 @@
         </w:tc>
         <w:tc>
           <w:tcPr>
-            <w:tcW w:type="dxa" w:w="2409"/>
+            <w:tcW w:type="dxa" w:w="3213"/>
           </w:tcPr>
           <w:p>
             <w:r>
-              <w:t>Thiên Hỷ</w:t>
-            </w:r>
-          </w:p>
-        </w:tc>
-      </w:tr>
-      <w:tr>
-        <w:tc>
-          <w:tcPr>
-            <w:tcW w:type="dxa" w:w="2409"/>
-          </w:tcPr>
-          <w:p>
-            <w:r>
-              <w:t>Thiên Đức</w:t>
-            </w:r>
-          </w:p>
-        </w:tc>
-        <w:tc>
-          <w:tcPr>
-            <w:tcW w:type="dxa" w:w="2409"/>
-          </w:tcPr>
-          <w:p>
-            <w:r>
-              <w:t>Thần sát</w:t>
-            </w:r>
-          </w:p>
-        </w:tc>
-        <w:tc>
-          <w:tcPr>
-            <w:tcW w:type="dxa" w:w="2409"/>
-          </w:tcPr>
-          <w:p>
-            <w:r>
-              <w:t>Có</w:t>
-            </w:r>
-          </w:p>
-        </w:tc>
-        <w:tc>
-          <w:tcPr>
-            <w:tcW w:type="dxa" w:w="2409"/>
-          </w:tcPr>
-          <w:p>
-            <w:r>
-              <w:t>Thiên Đức</w:t>
-            </w:r>
-          </w:p>
-        </w:tc>
-      </w:tr>
-      <w:tr>
-        <w:tc>
-          <w:tcPr>
-            <w:tcW w:type="dxa" w:w="2409"/>
-          </w:tcPr>
-          <w:p>
-            <w:r>
-              <w:t>Thiên Đức Quý Nhân</w:t>
-            </w:r>
-          </w:p>
-        </w:tc>
-        <w:tc>
-          <w:tcPr>
-            <w:tcW w:type="dxa" w:w="2409"/>
-          </w:tcPr>
-          <w:p>
-            <w:r>
-              <w:t>Thần sát</w:t>
-            </w:r>
-          </w:p>
-        </w:tc>
-        <w:tc>
-          <w:tcPr>
-            <w:tcW w:type="dxa" w:w="2409"/>
-          </w:tcPr>
-          <w:p>
-            <w:r>
-              <w:t>Có</w:t>
-            </w:r>
-          </w:p>
-        </w:tc>
-        <w:tc>
-          <w:tcPr>
-            <w:tcW w:type="dxa" w:w="2409"/>
-          </w:tcPr>
-          <w:p>
-            <w:r>
-              <w:t>Thiên Đức Quý Nhân</w:t>
-            </w:r>
-          </w:p>
-        </w:tc>
-      </w:tr>
-      <w:tr>
-        <w:tc>
-          <w:tcPr>
-            <w:tcW w:type="dxa" w:w="2409"/>
-          </w:tcPr>
-          <w:p>
-            <w:r>
-              <w:t>Nguyệt Đức</w:t>
-            </w:r>
-          </w:p>
-        </w:tc>
-        <w:tc>
-          <w:tcPr>
-            <w:tcW w:type="dxa" w:w="2409"/>
-          </w:tcPr>
-          <w:p>
-            <w:r>
-              <w:t>Thần sát</w:t>
-            </w:r>
-          </w:p>
-        </w:tc>
-        <w:tc>
-          <w:tcPr>
-            <w:tcW w:type="dxa" w:w="2409"/>
-          </w:tcPr>
-          <w:p>
-            <w:r>
-              <w:t>Có</w:t>
-            </w:r>
-          </w:p>
-        </w:tc>
-        <w:tc>
-          <w:tcPr>
-            <w:tcW w:type="dxa" w:w="2409"/>
-          </w:tcPr>
-          <w:p>
-            <w:r>
-              <w:t>Nguyệt Đức</w:t>
-            </w:r>
-          </w:p>
-        </w:tc>
-      </w:tr>
-      <w:tr>
-        <w:tc>
-          <w:tcPr>
-            <w:tcW w:type="dxa" w:w="2409"/>
-          </w:tcPr>
-          <w:p>
-            <w:r>
-              <w:t>Nguyệt Đức Quý Nhân</w:t>
-            </w:r>
-          </w:p>
-        </w:tc>
-        <w:tc>
-          <w:tcPr>
-            <w:tcW w:type="dxa" w:w="2409"/>
-          </w:tcPr>
-          <w:p>
-            <w:r>
-              <w:t>Thần sát</w:t>
-            </w:r>
-          </w:p>
-        </w:tc>
-        <w:tc>
-          <w:tcPr>
-            <w:tcW w:type="dxa" w:w="2409"/>
-          </w:tcPr>
-          <w:p>
-            <w:r>
-              <w:t>Có</w:t>
-            </w:r>
-          </w:p>
-        </w:tc>
-        <w:tc>
-          <w:tcPr>
-            <w:tcW w:type="dxa" w:w="2409"/>
-          </w:tcPr>
-          <w:p>
-            <w:r>
-              <w:t>Nguyệt Đức Quý Nhân</w:t>
+              <w:t>Có tại trụ Ngày</w:t>
             </w:r>
           </w:p>
         </w:tc>
@@ -1747,7 +1846,29 @@
           </w:tcPr>
           <w:p>
             <w:r>
-              <w:t>Hướng</w:t>
+              <w:t>Đại vận hiện tại</w:t>
+            </w:r>
+          </w:p>
+        </w:tc>
+        <w:tc>
+          <w:tcPr>
+            <w:tcW w:type="dxa" w:w="4819"/>
+          </w:tcPr>
+          <w:p>
+            <w:r>
+              <w:t>Ất Tỵ · 2022–2031 · 35–44</w:t>
+            </w:r>
+          </w:p>
+        </w:tc>
+      </w:tr>
+      <w:tr>
+        <w:tc>
+          <w:tcPr>
+            <w:tcW w:type="dxa" w:w="4819"/>
+          </w:tcPr>
+          <w:p>
+            <w:r>
+              <w:t>Chiều vận</w:t>
             </w:r>
           </w:p>
         </w:tc>
@@ -1769,7 +1890,7 @@
           </w:tcPr>
           <w:p>
             <w:r>
-              <w:t>Tuổi khởi</w:t>
+              <w:t>Tuổi khởi vận</w:t>
             </w:r>
           </w:p>
         </w:tc>
@@ -1780,6 +1901,50 @@
           <w:p>
             <w:r>
               <w:t>5</w:t>
+            </w:r>
+          </w:p>
+        </w:tc>
+      </w:tr>
+      <w:tr>
+        <w:tc>
+          <w:tcPr>
+            <w:tcW w:type="dxa" w:w="4819"/>
+          </w:tcPr>
+          <w:p>
+            <w:r>
+              <w:t>Căn cứ</w:t>
+            </w:r>
+          </w:p>
+        </w:tc>
+        <w:tc>
+          <w:tcPr>
+            <w:tcW w:type="dxa" w:w="4819"/>
+          </w:tcPr>
+          <w:p>
+            <w:r>
+              <w:t>Nam · Niên can Bính Dương · Thuận</w:t>
+            </w:r>
+          </w:p>
+        </w:tc>
+      </w:tr>
+      <w:tr>
+        <w:tc>
+          <w:tcPr>
+            <w:tcW w:type="dxa" w:w="4819"/>
+          </w:tcPr>
+          <w:p>
+            <w:r>
+              <w:t>Phương pháp V1.0</w:t>
+            </w:r>
+          </w:p>
+        </w:tc>
+        <w:tc>
+          <w:tcPr>
+            <w:tcW w:type="dxa" w:w="4819"/>
+          </w:tcPr>
+          <w:p>
+            <w:r>
+              <w:t>Khởi vận theo ngày lịch và Tiết khí · độ chính xác theo năm</w:t>
             </w:r>
           </w:p>
         </w:tc>
@@ -1856,7 +2021,7 @@
           </w:tcPr>
           <w:p>
             <w:r>
-              <w:t>Tóm tắt</w:t>
+              <w:t>Ngũ hành</w:t>
             </w:r>
           </w:p>
         </w:tc>
@@ -1918,7 +2083,7 @@
           </w:tcPr>
           <w:p>
             <w:r>
-              <w:t>Nhâm Dần</w:t>
+              <w:t>Nhâm · Thủy / Dần · Mộc</w:t>
             </w:r>
           </w:p>
         </w:tc>
@@ -1980,7 +2145,7 @@
           </w:tcPr>
           <w:p>
             <w:r>
-              <w:t>Quý Mão</w:t>
+              <w:t>Quý · Thủy / Mão · Mộc</w:t>
             </w:r>
           </w:p>
         </w:tc>
@@ -2042,7 +2207,7 @@
           </w:tcPr>
           <w:p>
             <w:r>
-              <w:t>Giáp Thìn</w:t>
+              <w:t>Giáp · Mộc / Thìn · Thổ</w:t>
             </w:r>
           </w:p>
         </w:tc>
@@ -2104,7 +2269,7 @@
           </w:tcPr>
           <w:p>
             <w:r>
-              <w:t>Ất Tỵ</w:t>
+              <w:t>Ất · Mộc / Tỵ · Hỏa</w:t>
             </w:r>
           </w:p>
         </w:tc>
@@ -2166,7 +2331,7 @@
           </w:tcPr>
           <w:p>
             <w:r>
-              <w:t>Bính Ngọ</w:t>
+              <w:t>Bính · Hỏa / Ngọ · Hỏa</w:t>
             </w:r>
           </w:p>
         </w:tc>
@@ -2228,7 +2393,7 @@
           </w:tcPr>
           <w:p>
             <w:r>
-              <w:t>Đinh Mùi</w:t>
+              <w:t>Đinh · Hỏa / Mùi · Thổ</w:t>
             </w:r>
           </w:p>
         </w:tc>
@@ -2290,7 +2455,7 @@
           </w:tcPr>
           <w:p>
             <w:r>
-              <w:t>Mậu Thân</w:t>
+              <w:t>Mậu · Thổ / Thân · Kim</w:t>
             </w:r>
           </w:p>
         </w:tc>
@@ -2352,7 +2517,7 @@
           </w:tcPr>
           <w:p>
             <w:r>
-              <w:t>Kỷ Dậu</w:t>
+              <w:t>Kỷ · Thổ / Dậu · Kim</w:t>
             </w:r>
           </w:p>
         </w:tc>
@@ -2414,7 +2579,7 @@
           </w:tcPr>
           <w:p>
             <w:r>
-              <w:t>Canh Tuất</w:t>
+              <w:t>Canh · Kim / Tuất · Thổ</w:t>
             </w:r>
           </w:p>
         </w:tc>
@@ -2476,17 +2641,12 @@
           </w:tcPr>
           <w:p>
             <w:r>
-              <w:t>Tân Hợi</w:t>
+              <w:t>Tân · Kim / Hợi · Thủy</w:t>
             </w:r>
           </w:p>
         </w:tc>
       </w:tr>
     </w:tbl>
-    <w:p>
-      <w:r>
-        <w:t>Toàn bộ đại vận (full luck cycles): DATA NOT PROVIDED BY RUNTIME</w:t>
-      </w:r>
-    </w:p>
     <w:p>
       <w:pPr>
         <w:pStyle w:val="Heading1"/>
@@ -2549,7 +2709,7 @@
     </w:p>
     <w:p>
       <w:r>
-        <w:t>Thần sát hiện diện: Thiên Ất Quý Nhân, Thiên Ất, Hồng Loan, Thiên Hỷ, Thiên Đức.</w:t>
+        <w:t>Thần sát hiện diện: Thiên Ất Quý Nhân, Hồng Loan, Thiên Đức Quý Nhân, Nguyệt Đức Quý Nhân.</w:t>
       </w:r>
     </w:p>
     <w:p>
@@ -2588,7 +2748,7 @@
     </w:p>
     <w:p>
       <w:r>
-        <w:t>Điểm tổng hợp: 51.25 — hạng D+.</w:t>
+        <w:t>Điểm tổng hợp: 53.05 — hạng D+.</w:t>
       </w:r>
     </w:p>
     <w:p/>

</xml_diff>